<commit_message>
fix: JDK 1.8.0 family 검증으로 전환
</commit_message>
<xml_diff>
--- a/docs/OFFLINE-USER-GUIDE.docx
+++ b/docs/OFFLINE-USER-GUIDE.docx
@@ -739,7 +739,7 @@
           <w:rFonts w:ascii="맑은 고딕" w:hAnsi="맑은 고딕"/>
           <w:sz w:val="21"/>
         </w:rPr>
-        <w:t xml:space="preserve">exact target JDK는 여전히 </w:t>
+        <w:t xml:space="preserve">required target JDK version family는 </w:t>
       </w:r>
       <w:r>
         <w:rPr>
@@ -747,6 +747,20 @@
           <w:b/>
           <w:sz w:val="21"/>
         </w:rPr>
+        <w:t>1.8.0</w:t>
+      </w:r>
+      <w:r>
+        <w:rPr>
+          <w:rFonts w:ascii="맑은 고딕" w:hAnsi="맑은 고딕"/>
+          <w:sz w:val="21"/>
+        </w:rPr>
+        <w:t xml:space="preserve">이다(exact update 버전 고정 없음, 예: </w:t>
+      </w:r>
+      <w:r>
+        <w:rPr>
+          <w:rFonts w:ascii="Consolas" w:hAnsi="Consolas"/>
+          <w:sz w:val="20"/>
+        </w:rPr>
         <w:t>1.8.0_111</w:t>
       </w:r>
       <w:r>
@@ -754,7 +768,21 @@
           <w:rFonts w:ascii="맑은 고딕" w:hAnsi="맑은 고딕"/>
           <w:sz w:val="21"/>
         </w:rPr>
-        <w:t>이다. 이 프로젝트의 현재 개발/검증 JDK가 1.8.0_111과 정확히 일치하기 전까지 target-JDK 최종 검증 완료를 주장하지 않는다.</w:t>
+        <w:t xml:space="preserve">/ </w:t>
+      </w:r>
+      <w:r>
+        <w:rPr>
+          <w:rFonts w:ascii="Consolas" w:hAnsi="Consolas"/>
+          <w:sz w:val="20"/>
+        </w:rPr>
+        <w:t>1.8.0_503</w:t>
+      </w:r>
+      <w:r>
+        <w:rPr>
+          <w:rFonts w:ascii="맑은 고딕" w:hAnsi="맑은 고딕"/>
+          <w:sz w:val="21"/>
+        </w:rPr>
+        <w:t>). 이 프로젝트의 현재 개발/검증 JDK가 이 family에 속하지 않으면 target-JDK 검증 완료를 주장하지 않는다.</w:t>
       </w:r>
     </w:p>
     <w:p>
@@ -813,7 +841,7 @@
           <w:rFonts w:ascii="맑은 고딕" w:hAnsi="맑은 고딕"/>
           <w:sz w:val="21"/>
         </w:rPr>
-        <w:t xml:space="preserve">에 위임하는 thin wrapper로, exact-JDK gate를 포함해 동일한 검증 결과를 낸다(legacy </w:t>
+        <w:t xml:space="preserve">에 위임하는 thin wrapper로, JDK 1.8.0 family gate를 포함해 동일한 검증 결과를 낸다(legacy </w:t>
       </w:r>
       <w:r>
         <w:rPr>
@@ -1406,7 +1434,7 @@
           <w:rFonts w:ascii="맑은 고딕" w:hAnsi="맑은 고딕"/>
           <w:sz w:val="21"/>
         </w:rPr>
-        <w:t xml:space="preserve">이 entrypoint는 exact-JDK 게이트/compile/regression 로직을 자체 구현하지 않고 </w:t>
+        <w:t xml:space="preserve">이 entrypoint는 JDK 1.8.0 family 게이트/compile/regression 로직을 자체 구현하지 않고 </w:t>
       </w:r>
       <w:r>
         <w:rPr>
@@ -1661,7 +1689,7 @@
           <w:rFonts w:ascii="맑은 고딕" w:hAnsi="맑은 고딕"/>
           <w:sz w:val="21"/>
         </w:rPr>
-        <w:t xml:space="preserve"> 선언과 실제 CRLF 커밋 바이트 두 가지를 모두 포함한다. 이 계약 덕분에 exact-JDK 게이트는 개발자의 </w:t>
+        <w:t xml:space="preserve"> 선언과 실제 CRLF 커밋 바이트 두 가지를 모두 포함한다. 이 계약 덕분에 JDK 1.8.0 family 게이트는 개발자의 </w:t>
       </w:r>
       <w:r>
         <w:rPr>
@@ -1733,7 +1761,7 @@
           <w:rFonts w:ascii="맑은 고딕" w:hAnsi="맑은 고딕"/>
           <w:sz w:val="21"/>
         </w:rPr>
-        <w:t>가 찾지 못하면 exact-JDK gate를 통과한 것으로 절대 간주하지 않고 명시적으로 실패한다).</w:t>
+        <w:t>가 찾지 못하면 JDK 1.8.0 family gate를 통과한 것으로 절대 간주하지 않고 명시적으로 실패한다).</w:t>
       </w:r>
     </w:p>
     <w:p>
@@ -1959,6 +1987,20 @@
                 <w:b/>
                 <w:sz w:val="19"/>
               </w:rPr>
+              <w:t>1.8.0 family</w:t>
+            </w:r>
+            <w:r>
+              <w:rPr>
+                <w:rFonts w:ascii="맑은 고딕" w:hAnsi="맑은 고딕"/>
+                <w:sz w:val="19"/>
+              </w:rPr>
+              <w:t xml:space="preserve">(exact update 버전 고정 없음 — 예: </w:t>
+            </w:r>
+            <w:r>
+              <w:rPr>
+                <w:rFonts w:ascii="Consolas" w:hAnsi="Consolas"/>
+                <w:sz w:val="18"/>
+              </w:rPr>
               <w:t>1.8.0_111</w:t>
             </w:r>
             <w:r>
@@ -1966,7 +2008,21 @@
                 <w:rFonts w:ascii="맑은 고딕" w:hAnsi="맑은 고딕"/>
                 <w:sz w:val="19"/>
               </w:rPr>
-              <w:t xml:space="preserve"> (exact)</w:t>
+              <w:t xml:space="preserve">, </w:t>
+            </w:r>
+            <w:r>
+              <w:rPr>
+                <w:rFonts w:ascii="Consolas" w:hAnsi="Consolas"/>
+                <w:sz w:val="18"/>
+              </w:rPr>
+              <w:t>1.8.0_503</w:t>
+            </w:r>
+            <w:r>
+              <w:rPr>
+                <w:rFonts w:ascii="맑은 고딕" w:hAnsi="맑은 고딕"/>
+                <w:sz w:val="19"/>
+              </w:rPr>
+              <w:t>)</w:t>
             </w:r>
           </w:p>
         </w:tc>
@@ -2504,14 +2560,42 @@
           <w:b/>
           <w:sz w:val="21"/>
         </w:rPr>
-        <w:t>JDK 1.8.0_111</w:t>
-      </w:r>
-      <w:r>
-        <w:rPr>
-          <w:rFonts w:ascii="맑은 고딕" w:hAnsi="맑은 고딕"/>
-          <w:sz w:val="21"/>
-        </w:rPr>
-        <w:t xml:space="preserve">을 선택(없으면 </w:t>
+        <w:t>JDK 1.8.0 family</w:t>
+      </w:r>
+      <w:r>
+        <w:rPr>
+          <w:rFonts w:ascii="맑은 고딕" w:hAnsi="맑은 고딕"/>
+          <w:sz w:val="21"/>
+        </w:rPr>
+        <w:t xml:space="preserve">(예: </w:t>
+      </w:r>
+      <w:r>
+        <w:rPr>
+          <w:rFonts w:ascii="Consolas" w:hAnsi="Consolas"/>
+          <w:sz w:val="20"/>
+        </w:rPr>
+        <w:t>1.8.0_111</w:t>
+      </w:r>
+      <w:r>
+        <w:rPr>
+          <w:rFonts w:ascii="맑은 고딕" w:hAnsi="맑은 고딕"/>
+          <w:sz w:val="21"/>
+        </w:rPr>
+        <w:t xml:space="preserve">, </w:t>
+      </w:r>
+      <w:r>
+        <w:rPr>
+          <w:rFonts w:ascii="Consolas" w:hAnsi="Consolas"/>
+          <w:sz w:val="20"/>
+        </w:rPr>
+        <w:t>1.8.0_503</w:t>
+      </w:r>
+      <w:r>
+        <w:rPr>
+          <w:rFonts w:ascii="맑은 고딕" w:hAnsi="맑은 고딕"/>
+          <w:sz w:val="21"/>
+        </w:rPr>
+        <w:t xml:space="preserve">)를 선택(없으면 </w:t>
       </w:r>
       <w:r>
         <w:rPr>
@@ -2863,14 +2947,42 @@
           <w:b/>
           <w:sz w:val="21"/>
         </w:rPr>
-        <w:t>JDK 1.8.0_111</w:t>
-      </w:r>
-      <w:r>
-        <w:rPr>
-          <w:rFonts w:ascii="맑은 고딕" w:hAnsi="맑은 고딕"/>
-          <w:sz w:val="21"/>
-        </w:rPr>
-        <w:t>을 추가 등록한다.</w:t>
+        <w:t>JDK 1.8.0 family</w:t>
+      </w:r>
+      <w:r>
+        <w:rPr>
+          <w:rFonts w:ascii="맑은 고딕" w:hAnsi="맑은 고딕"/>
+          <w:sz w:val="21"/>
+        </w:rPr>
+        <w:t xml:space="preserve">(예: </w:t>
+      </w:r>
+      <w:r>
+        <w:rPr>
+          <w:rFonts w:ascii="Consolas" w:hAnsi="Consolas"/>
+          <w:sz w:val="20"/>
+        </w:rPr>
+        <w:t>1.8.0_111</w:t>
+      </w:r>
+      <w:r>
+        <w:rPr>
+          <w:rFonts w:ascii="맑은 고딕" w:hAnsi="맑은 고딕"/>
+          <w:sz w:val="21"/>
+        </w:rPr>
+        <w:t xml:space="preserve">, </w:t>
+      </w:r>
+      <w:r>
+        <w:rPr>
+          <w:rFonts w:ascii="Consolas" w:hAnsi="Consolas"/>
+          <w:sz w:val="20"/>
+        </w:rPr>
+        <w:t>1.8.0_503</w:t>
+      </w:r>
+      <w:r>
+        <w:rPr>
+          <w:rFonts w:ascii="맑은 고딕" w:hAnsi="맑은 고딕"/>
+          <w:sz w:val="21"/>
+        </w:rPr>
+        <w:t>)를 추가 등록한다.</w:t>
       </w:r>
     </w:p>
     <w:p>
@@ -2940,7 +3052,7 @@
           <w:rFonts w:ascii="맑은 고딕" w:hAnsi="맑은 고딕"/>
           <w:sz w:val="21"/>
         </w:rPr>
-        <w:t>에 방금 등록한 JDK 1.8.0_111을 연결한다(</w:t>
+        <w:t>에 방금 등록한 JDK를 연결한다(</w:t>
       </w:r>
       <w:r>
         <w:rPr>
@@ -3195,7 +3307,7 @@
           <w:rFonts w:ascii="Consolas" w:hAnsi="Consolas"/>
           <w:sz w:val="19"/>
         </w:rPr>
-        <w:t>JAVA_HOME을 JDK 1.8.0_111 설치 경로로 설정</w:t>
+        <w:t>JAVA_HOME을 JDK 1.8.0 family 설치 경로로 설정(예: 1.8.0_111, 1.8.0_503)</w:t>
       </w:r>
       <w:r>
         <w:rPr>
@@ -3436,7 +3548,7 @@
           <w:rFonts w:ascii="맑은 고딕" w:hAnsi="맑은 고딕"/>
           <w:sz w:val="21"/>
         </w:rPr>
-        <w:t xml:space="preserve">정확히 1.8.0_111이면 </w:t>
+        <w:t xml:space="preserve">java/javac 버전 token이 둘 다 JDK 1.8.0 family(exact update 고정 없음)이면 </w:t>
       </w:r>
       <w:r>
         <w:rPr>
@@ -3450,7 +3562,7 @@
           <w:rFonts w:ascii="맑은 고딕" w:hAnsi="맑은 고딕"/>
           <w:sz w:val="21"/>
         </w:rPr>
-        <w:t xml:space="preserve">, 아니면 </w:t>
+        <w:t xml:space="preserve">, 하나라도 아니면 </w:t>
       </w:r>
       <w:r>
         <w:rPr>
@@ -3767,7 +3879,7 @@
           <w:rFonts w:ascii="맑은 고딕" w:hAnsi="맑은 고딕"/>
           <w:sz w:val="21"/>
         </w:rPr>
-        <w:t xml:space="preserve">가 실제로 수행하는 것은 exact JDK gate(fail-closed) + production/test compile + 전체 project-local test suite 실행이며, 이는 </w:t>
+        <w:t xml:space="preserve">가 실제로 수행하는 것은 JDK 1.8.0 family gate(fail-closed) + production/test compile + 전체 project-local test suite 실행이며, 이는 </w:t>
       </w:r>
       <w:r>
         <w:rPr>
@@ -3781,7 +3893,7 @@
           <w:rFonts w:ascii="맑은 고딕" w:hAnsi="맑은 고딕"/>
           <w:sz w:val="21"/>
         </w:rPr>
-        <w:t>와 동일하다(항목 2-1 참고). exact-JDK 실패 시 시각적으로 여전히 명확히 표시된다.</w:t>
+        <w:t>와 동일하다(항목 2-1 참고). family gate 실패 시 시각적으로 여전히 명확히 표시된다.</w:t>
       </w:r>
     </w:p>
     <w:p>
@@ -3945,7 +4057,7 @@
                 <w:rFonts w:ascii="맑은 고딕" w:hAnsi="맑은 고딕"/>
                 <w:sz w:val="19"/>
               </w:rPr>
-              <w:t>exact JDK 1.8.0_111 게이트</w:t>
+              <w:t>JDK 1.8.0 family 게이트</w:t>
             </w:r>
           </w:p>
         </w:tc>
@@ -3996,7 +4108,21 @@
                 <w:rFonts w:ascii="맑은 고딕" w:hAnsi="맑은 고딕"/>
                 <w:sz w:val="19"/>
               </w:rPr>
-              <w:t xml:space="preserve"> 둘 다 정확히 1.8.0_111이어야 PASS. 다른 8u 버전/JDK11/17/21/</w:t>
+              <w:t xml:space="preserve"> 각각의 버전 token이 독립적으로 </w:t>
+            </w:r>
+            <w:r>
+              <w:rPr>
+                <w:rFonts w:ascii="Consolas" w:hAnsi="Consolas"/>
+                <w:sz w:val="18"/>
+              </w:rPr>
+              <w:t>1.8.0</w:t>
+            </w:r>
+            <w:r>
+              <w:rPr>
+                <w:rFonts w:ascii="맑은 고딕" w:hAnsi="맑은 고딕"/>
+                <w:sz w:val="19"/>
+              </w:rPr>
+              <w:t xml:space="preserve"> family여야 PASS(둘의 update 번호가 달라도 무방, exact update 고정 없음). JDK11/17/21/</w:t>
             </w:r>
             <w:r>
               <w:rPr>
@@ -4010,7 +4136,7 @@
                 <w:rFonts w:ascii="맑은 고딕" w:hAnsi="맑은 고딕"/>
                 <w:sz w:val="19"/>
               </w:rPr>
-              <w:t>은 인정하지 않음</w:t>
+              <w:t>은 여전히 인정하지 않음</w:t>
             </w:r>
           </w:p>
         </w:tc>
@@ -4532,7 +4658,7 @@
           <w:b/>
           <w:sz w:val="21"/>
         </w:rPr>
-        <w:t xml:space="preserve">exact JDK 1.8.0_111이 없는 PC에서는 1단계가 반드시 FAIL하고 전체 결과가 </w:t>
+        <w:t xml:space="preserve">JDK 1.8.0 family(예: </w:t>
       </w:r>
       <w:r>
         <w:rPr>
@@ -4540,6 +4666,38 @@
           <w:b/>
           <w:sz w:val="20"/>
         </w:rPr>
+        <w:t>1.8.0_111</w:t>
+      </w:r>
+      <w:r>
+        <w:rPr>
+          <w:rFonts w:ascii="맑은 고딕" w:hAnsi="맑은 고딕"/>
+          <w:b/>
+          <w:sz w:val="21"/>
+        </w:rPr>
+        <w:t xml:space="preserve">, </w:t>
+      </w:r>
+      <w:r>
+        <w:rPr>
+          <w:rFonts w:ascii="Consolas" w:hAnsi="Consolas"/>
+          <w:b/>
+          <w:sz w:val="20"/>
+        </w:rPr>
+        <w:t>1.8.0_503</w:t>
+      </w:r>
+      <w:r>
+        <w:rPr>
+          <w:rFonts w:ascii="맑은 고딕" w:hAnsi="맑은 고딕"/>
+          <w:b/>
+          <w:sz w:val="21"/>
+        </w:rPr>
+        <w:t xml:space="preserve">)가 없는 PC에서는 1단계가 반드시 FAIL하고 전체 결과가 </w:t>
+      </w:r>
+      <w:r>
+        <w:rPr>
+          <w:rFonts w:ascii="Consolas" w:hAnsi="Consolas"/>
+          <w:b/>
+          <w:sz w:val="20"/>
+        </w:rPr>
         <w:t>[CORE_VERIFICATION_FAIL]</w:t>
       </w:r>
       <w:r>
@@ -4555,7 +4713,7 @@
           <w:rFonts w:ascii="맑은 고딕" w:hAnsi="맑은 고딕"/>
           <w:sz w:val="21"/>
         </w:rPr>
-        <w:t xml:space="preserve"> 다른 JDK로는 target-JDK 인증을 받을 수 없다는 원칙을 이 스크립트가 강제하는 것뿐이다.</w:t>
+        <w:t xml:space="preserve"> 이 family 밖의 다른 JDK로는 target-JDK 인증을 받을 수 없다는 원칙을 이 스크립트가 강제하는 것뿐이다.</w:t>
       </w:r>
     </w:p>
     <w:p>
@@ -6560,6 +6718,135 @@
           <w:sz w:val="21"/>
         </w:rPr>
         <w:t>이나, 이는 위 fail-closed 계약 한계들을 무효화하지 않으며 GitHub Push/공개 배포 완료를 뜻하지도 않는다.</w:t>
+      </w:r>
+    </w:p>
+    <w:p>
+      <w:r>
+        <w:rPr>
+          <w:rFonts w:ascii="맑은 고딕" w:hAnsi="맑은 고딕"/>
+          <w:b/>
+          <w:sz w:val="21"/>
+        </w:rPr>
+        <w:t>현재(Slice 100E-I) gate standing</w:t>
+      </w:r>
+      <w:r>
+        <w:rPr>
+          <w:rFonts w:ascii="맑은 고딕" w:hAnsi="맑은 고딕"/>
+          <w:sz w:val="21"/>
+        </w:rPr>
+        <w:t xml:space="preserve">(위 Slice 99I 단락과 구분되는 별도 standing -- 과거 인증 사실을 현재 mandatory 요구사항으로 재해석하지 않는다): </w:t>
+      </w:r>
+      <w:r>
+        <w:rPr>
+          <w:rFonts w:ascii="Consolas" w:hAnsi="Consolas"/>
+          <w:sz w:val="20"/>
+        </w:rPr>
+        <w:t>HISTORICAL_EXACT_JDK_1_8_0_111_CERTIFICATION = PASS</w:t>
+      </w:r>
+      <w:r>
+        <w:rPr>
+          <w:rFonts w:ascii="맑은 고딕" w:hAnsi="맑은 고딕"/>
+          <w:sz w:val="21"/>
+        </w:rPr>
+        <w:t xml:space="preserve">(위 단락 그대로 보존), </w:t>
+      </w:r>
+      <w:r>
+        <w:rPr>
+          <w:rFonts w:ascii="Consolas" w:hAnsi="Consolas"/>
+          <w:sz w:val="20"/>
+        </w:rPr>
+        <w:t>CURRENT_REQUIRED_JDK_VERSION_FAMILY = 1.8.0</w:t>
+      </w:r>
+      <w:r>
+        <w:rPr>
+          <w:rFonts w:ascii="맑은 고딕" w:hAnsi="맑은 고딕"/>
+          <w:sz w:val="21"/>
+        </w:rPr>
+        <w:t xml:space="preserve">, </w:t>
+      </w:r>
+      <w:r>
+        <w:rPr>
+          <w:rFonts w:ascii="Consolas" w:hAnsi="Consolas"/>
+          <w:sz w:val="20"/>
+        </w:rPr>
+        <w:t>CURRENT_EXACT_UPDATE_PINNING_REQUIRED = FALSE</w:t>
+      </w:r>
+      <w:r>
+        <w:rPr>
+          <w:rFonts w:ascii="맑은 고딕" w:hAnsi="맑은 고딕"/>
+          <w:sz w:val="21"/>
+        </w:rPr>
+        <w:t xml:space="preserve">. 현재 </w:t>
+      </w:r>
+      <w:r>
+        <w:rPr>
+          <w:rFonts w:ascii="Consolas" w:hAnsi="Consolas"/>
+          <w:sz w:val="20"/>
+        </w:rPr>
+        <w:t>verify-standalone.bat</w:t>
+      </w:r>
+      <w:r>
+        <w:rPr>
+          <w:rFonts w:ascii="맑은 고딕" w:hAnsi="맑은 고딕"/>
+          <w:sz w:val="21"/>
+        </w:rPr>
+        <w:t xml:space="preserve">는 java/javac 버전 token이 각각 </w:t>
+      </w:r>
+      <w:r>
+        <w:rPr>
+          <w:rFonts w:ascii="Consolas" w:hAnsi="Consolas"/>
+          <w:sz w:val="20"/>
+        </w:rPr>
+        <w:t>1.8.0</w:t>
+      </w:r>
+      <w:r>
+        <w:rPr>
+          <w:rFonts w:ascii="맑은 고딕" w:hAnsi="맑은 고딕"/>
+          <w:sz w:val="21"/>
+        </w:rPr>
+        <w:t xml:space="preserve"> family(예: </w:t>
+      </w:r>
+      <w:r>
+        <w:rPr>
+          <w:rFonts w:ascii="Consolas" w:hAnsi="Consolas"/>
+          <w:sz w:val="20"/>
+        </w:rPr>
+        <w:t>1.8.0_111</w:t>
+      </w:r>
+      <w:r>
+        <w:rPr>
+          <w:rFonts w:ascii="맑은 고딕" w:hAnsi="맑은 고딕"/>
+          <w:sz w:val="21"/>
+        </w:rPr>
+        <w:t xml:space="preserve">, </w:t>
+      </w:r>
+      <w:r>
+        <w:rPr>
+          <w:rFonts w:ascii="Consolas" w:hAnsi="Consolas"/>
+          <w:sz w:val="20"/>
+        </w:rPr>
+        <w:t>1.8.0_503</w:t>
+      </w:r>
+      <w:r>
+        <w:rPr>
+          <w:rFonts w:ascii="맑은 고딕" w:hAnsi="맑은 고딕"/>
+          <w:sz w:val="21"/>
+        </w:rPr>
+        <w:t xml:space="preserve">, 서로 다른 update 조합도 허용)에 속하기만 하면 PASS로 인정하며, 두 실행파일이 같은 설치 경로에서 왔는지 확인하는 filesystem 검사는 하지 않는다(항목 2-1, </w:t>
+      </w:r>
+      <w:r>
+        <w:rPr>
+          <w:rFonts w:ascii="Consolas" w:hAnsi="Consolas"/>
+          <w:sz w:val="20"/>
+        </w:rPr>
+        <w:t>README.md</w:t>
+      </w:r>
+      <w:r>
+        <w:rPr>
+          <w:rFonts w:ascii="맑은 고딕" w:hAnsi="맑은 고딕"/>
+          <w:sz w:val="21"/>
+        </w:rPr>
+        <w:t xml:space="preserve"> 항목 8 참고).</w:t>
       </w:r>
     </w:p>
     <w:p>
@@ -6880,7 +7167,35 @@
                 <w:rFonts w:ascii="맑은 고딕" w:hAnsi="맑은 고딕"/>
                 <w:sz w:val="19"/>
               </w:rPr>
-              <w:t xml:space="preserve">로 종료. JDK 1.8.0_111의 </w:t>
+              <w:t xml:space="preserve">로 종료. JDK 1.8.0 family(예: </w:t>
+            </w:r>
+            <w:r>
+              <w:rPr>
+                <w:rFonts w:ascii="Consolas" w:hAnsi="Consolas"/>
+                <w:sz w:val="18"/>
+              </w:rPr>
+              <w:t>1.8.0_111</w:t>
+            </w:r>
+            <w:r>
+              <w:rPr>
+                <w:rFonts w:ascii="맑은 고딕" w:hAnsi="맑은 고딕"/>
+                <w:sz w:val="19"/>
+              </w:rPr>
+              <w:t xml:space="preserve">, </w:t>
+            </w:r>
+            <w:r>
+              <w:rPr>
+                <w:rFonts w:ascii="Consolas" w:hAnsi="Consolas"/>
+                <w:sz w:val="18"/>
+              </w:rPr>
+              <w:t>1.8.0_503</w:t>
+            </w:r>
+            <w:r>
+              <w:rPr>
+                <w:rFonts w:ascii="맑은 고딕" w:hAnsi="맑은 고딕"/>
+                <w:sz w:val="19"/>
+              </w:rPr>
+              <w:t xml:space="preserve">)의 </w:t>
             </w:r>
             <w:r>
               <w:rPr>
@@ -7024,7 +7339,7 @@
                 <w:rFonts w:ascii="맑은 고딕" w:hAnsi="맑은 고딕"/>
                 <w:sz w:val="19"/>
               </w:rPr>
-              <w:t>로 fail-closed 처리한다(검증 실패) — exact 1.8.0_111만 인정</w:t>
+              <w:t>로 fail-closed 처리한다(검증 실패) — java/javac 각각 JDK 1.8.0 family(exact update 고정 없음)만 인정</w:t>
             </w:r>
           </w:p>
         </w:tc>
@@ -7117,7 +7432,7 @@
                 <w:rFonts w:ascii="맑은 고딕" w:hAnsi="맑은 고딕"/>
                 <w:sz w:val="19"/>
               </w:rPr>
-              <w:t>에서 JDK 1.8.0_111의 실제 설치 경로를 다시 지정</w:t>
+              <w:t>에서 JDK 1.8.0 family의 실제 설치 경로를 다시 지정</w:t>
             </w:r>
           </w:p>
         </w:tc>
@@ -7382,7 +7697,7 @@
                 <w:rFonts w:ascii="맑은 고딕" w:hAnsi="맑은 고딕"/>
                 <w:sz w:val="19"/>
               </w:rPr>
-              <w:t>는 현재 exact JDK gate + compile + 전체 test suite만 수행하며 Python/Node 관련 optional 단계가 없다(항목 10 참고)</w:t>
+              <w:t>는 현재 JDK 1.8.0 family gate + compile + 전체 test suite만 수행하며 Python/Node 관련 optional 단계가 없다(항목 10 참고)</w:t>
             </w:r>
           </w:p>
         </w:tc>
@@ -7590,7 +7905,7 @@
           <w:rFonts w:ascii="Consolas" w:hAnsi="Consolas"/>
           <w:sz w:val="19"/>
         </w:rPr>
-        <w:t>[ ] JDK 1.8.0_111 확인 (java -version / javac -version 둘 다 정확히 일치해야 함)</w:t>
+        <w:t>[ ] JDK 1.8.0 family 확인 (java -version / javac -version 각각 1.8.0 family여야 함, 예:</w:t>
       </w:r>
       <w:r>
         <w:rPr>
@@ -7598,7 +7913,7 @@
           <w:sz w:val="19"/>
         </w:rPr>
         <w:br/>
-        <w:t>[ ] IntelliJ 또는 Eclipse SDK 연결 (또는 Command Line만 사용)</w:t>
+        <w:t xml:space="preserve">    1.8.0_111/1.8.0_503, 서로 다른 update 조합도 허용)</w:t>
       </w:r>
       <w:r>
         <w:rPr>
@@ -7606,7 +7921,7 @@
           <w:sz w:val="19"/>
         </w:rPr>
         <w:br/>
-        <w:t>[ ] build 성공 (build.bat / build.sh)</w:t>
+        <w:t>[ ] IntelliJ 또는 Eclipse SDK 연결 (또는 Command Line만 사용)</w:t>
       </w:r>
       <w:r>
         <w:rPr>
@@ -7614,7 +7929,7 @@
           <w:sz w:val="19"/>
         </w:rPr>
         <w:br/>
-        <w:t>[ ] verify-standalone.bat(또는 verify-offline.bat/verify-offline.sh) 실행 -- exact JDK 미보유 시</w:t>
+        <w:t>[ ] build 성공 (build.bat / build.sh)</w:t>
       </w:r>
       <w:r>
         <w:rPr>
@@ -7622,7 +7937,15 @@
           <w:sz w:val="19"/>
         </w:rPr>
         <w:br/>
-        <w:t xml:space="preserve">    [TARGET_JDK_MISMATCH_FAIL]로 종료하는 것이 정상 동작이다</w:t>
+        <w:t>[ ] verify-standalone.bat(또는 verify-offline.bat/verify-offline.sh) 실행 -- JDK 1.8.0 family</w:t>
+      </w:r>
+      <w:r>
+        <w:rPr>
+          <w:rFonts w:ascii="Consolas" w:hAnsi="Consolas"/>
+          <w:sz w:val="19"/>
+        </w:rPr>
+        <w:br/>
+        <w:t xml:space="preserve">    미보유 시 [TARGET_JDK_MISMATCH_FAIL]로 종료하는 것이 정상 동작이다</w:t>
       </w:r>
       <w:r>
         <w:rPr>

</xml_diff>

<commit_message>
docs: WebSquare AI 6.0 대상 플랫폼 명시
</commit_message>
<xml_diff>
--- a/docs/OFFLINE-USER-GUIDE.docx
+++ b/docs/OFFLINE-USER-GUIDE.docx
@@ -133,6 +133,58 @@
       </w:r>
     </w:p>
     <w:p>
+      <w:r>
+        <w:rPr>
+          <w:rFonts w:ascii="맑은 고딕" w:hAnsi="맑은 고딕"/>
+          <w:sz w:val="21"/>
+        </w:rPr>
+        <w:t xml:space="preserve">이 프로젝트가 생성하는 WebSquare XML의 target 플랫폼은 </w:t>
+      </w:r>
+      <w:r>
+        <w:rPr>
+          <w:rFonts w:ascii="맑은 고딕" w:hAnsi="맑은 고딕"/>
+          <w:b/>
+          <w:sz w:val="21"/>
+        </w:rPr>
+        <w:t>WebSquare AI 6.0</w:t>
+      </w:r>
+      <w:r>
+        <w:rPr>
+          <w:rFonts w:ascii="맑은 고딕" w:hAnsi="맑은 고딕"/>
+          <w:sz w:val="21"/>
+        </w:rPr>
+        <w:t>이다 -- WebSquare AI 6.0 major contract를 target으로 하며, exact maintenance build는 현재 pin하지 않는다 (</w:t>
+      </w:r>
+      <w:r>
+        <w:rPr>
+          <w:rFonts w:ascii="Consolas" w:hAnsi="Consolas"/>
+          <w:sz w:val="20"/>
+        </w:rPr>
+        <w:t>TARGET_WEBSQUARE_PLATFORM = WebSquare AI 6.0</w:t>
+      </w:r>
+      <w:r>
+        <w:rPr>
+          <w:rFonts w:ascii="맑은 고딕" w:hAnsi="맑은 고딕"/>
+          <w:sz w:val="21"/>
+        </w:rPr>
+        <w:t xml:space="preserve">, </w:t>
+      </w:r>
+      <w:r>
+        <w:rPr>
+          <w:rFonts w:ascii="Consolas" w:hAnsi="Consolas"/>
+          <w:sz w:val="20"/>
+        </w:rPr>
+        <w:t>EXACT_MAINTENANCE_BUILD_PINNED = FALSE</w:t>
+      </w:r>
+      <w:r>
+        <w:rPr>
+          <w:rFonts w:ascii="맑은 고딕" w:hAnsi="맑은 고딕"/>
+          <w:sz w:val="21"/>
+        </w:rPr>
+        <w:t>). WebSquare AI 6.0 공식 API/documentation이 이 target WebSquare contract의 1차 authority이며, 과거 WebSquare SP 계열 또는 legacy runtime 결과는 historical/compatibility evidence일 뿐 현재 target contract authority는 아니다.</w:t>
+      </w:r>
+    </w:p>
+    <w:p>
       <w:pPr>
         <w:pStyle w:val="Heading2"/>
       </w:pPr>
@@ -1810,7 +1862,7 @@
           <w:rFonts w:ascii="맑은 고딕" w:hAnsi="맑은 고딕"/>
           <w:sz w:val="21"/>
         </w:rPr>
-        <w:t>(과거 frozen snapshot의 historical policy record)에 그대로 보존되어 있다.</w:t>
+        <w:t>(과거 frozen snapshot의 historical policy record)에 그대로 보존되어 있다. 이 historical 기록은 현재 target인 WebSquare AI 6.0 이전 시점(WebSquare SP 계열)의 point-in-time evidence이며, 원본 그대로 보존되어 있고 현재 target contract authority가 아니다.</w:t>
       </w:r>
     </w:p>
     <w:p>

</xml_diff>